<commit_message>
ACT_EXTR: informe favorable, seccio ABANS DE L'INICI com el de referencia
- Encapcalament en MAJUSCULES 'ABANS DE L'INICI DE L'ACTIVITAT EXTRAORDINARIA:'.
- Els tres certificats passen a ser punts de primer nivell, cadascun
  comencant per 'S'haura de presentar un/els ...' (s'elimina la linia
  intermedia 'S'haura de presentar al Registre Municipal...').

Co-Authored-By: Claude Opus 4.8 <noreply@anthropic.com>
Claude-Session: https://claude.ai/code/session_01JMJrmChJ5HaLxF2Q9xTa1S
</commit_message>
<xml_diff>
--- a/ESTRUCTURALS/ACT_EXTR_FAV.docx
+++ b/ESTRUCTURALS/ACT_EXTR_FAV.docx
@@ -265,7 +265,7 @@
     <w:p>
       <w:pPr/>
       <w:r>
-        <w:t>Abans de l’inici de l’activitat extraordinària de caràcter esporàdic:</w:t>
+        <w:t>ABANS DE L’INICI DE L’ACTIVITAT EXTRAORDINÀRIA:</w:t>
       </w:r>
     </w:p>
     <w:p>
@@ -273,39 +273,25 @@
         <w:pStyle w:val="Ttulo2"/>
       </w:pPr>
       <w:r>
-        <w:t>[[FAV_PRESENTAR]] Presentació al registre</w:t>
+        <w:t>[[FAV_CERTIFICATS]] Certificats a presentar</w:t>
       </w:r>
     </w:p>
     <w:p>
       <w:pPr/>
       <w:r>
-        <w:t>S’haurà de presentar al Registre Municipal abans de l’inici de l’activitat:</w:t>
-      </w:r>
-    </w:p>
-    <w:p>
-      <w:pPr>
-        <w:pStyle w:val="Ttulo2"/>
-      </w:pPr>
-      <w:r>
-        <w:t>[[FAV_CERTIFICATS]] ::CHILD:: Certificats a presentar</w:t>
+        <w:t>S’haurà de presentar un Certificat d'instal·lació elèctrica i de muntatge signat electrònicament per un tècnic competent o una entitat col·laboradora de l’Administració, en el que es faci constar que el conjunt de les instal·lacions no permanents desmuntables funcionen correctament i complint amb la normativa vigent, d’acord amb l’article 39 del Decret 112/2010, de 31 d’agost, pel qual s’aprova el Reglament d’Espectacles Públics i Activitats Recreatives.</w:t>
       </w:r>
     </w:p>
     <w:p>
       <w:pPr/>
       <w:r>
-        <w:t>Certificat d'instal·lació elèctrica i de muntatge signat electrònicament per un tècnic competent o una entitat col·laboradora de l’Administració, en el que es faci constar que el conjunt de les instal·lacions no permanents desmuntables funcionen correctament i complint amb la normativa vigent, d’acord amb l’article 39 del Decret 112/2010, de 31 d’agost, pel qual s’aprova el Reglament d’Espectacles Públics i Activitats Recreatives.</w:t>
+        <w:t>S’haurà de presentar un Control inicial favorable signat electrònicament per un tècnic competent, en el que es faci constar que la documentació tècnica presentada és suficient i correcta, de la mateixa manera que les característiques de l’activitat són les adients, també d’acord amb l’article 39 del Decret 112/2010, de 31 d’agost, pel qual s’aprova el Reglament d’Espectacles Públics i Activitats Recreatives.</w:t>
       </w:r>
     </w:p>
     <w:p>
       <w:pPr/>
       <w:r>
-        <w:t>Control inicial favorable signat electrònicament per un tècnic competent, en el que es faci constar que la documentació tècnica presentada és suficient i correcta, de la mateixa manera que les característiques de l’activitat són les adients, també d’acord amb l’article 39 del Decret 112/2010, de 31 d’agost, pel qual s’aprova el Reglament d’Espectacles Públics i Activitats Recreatives.</w:t>
-      </w:r>
-    </w:p>
-    <w:p>
-      <w:pPr/>
-      <w:r>
-        <w:t>Certificats de reacció al foc dels elements decoratius instal·lats que no pertanyen a la pròpia llicència de l’establiment, en compliment amb el CTE DB SI 1 Apartat 4 Reacció al foc dels elements constructius, decoratius i de mobiliari.</w:t>
+        <w:t>S’haurà de presentar els Certificats de reacció al foc dels elements decoratius instal·lats que no pertanyen a la pròpia llicència de l’establiment, en compliment amb el CTE DB SI 1 Apartat 4 Reacció al foc dels elements constructius, decoratius i de mobiliari.</w:t>
       </w:r>
     </w:p>
     <w:p>

</xml_diff>

<commit_message>
ACT_EXTR favorable: text justificat i espai sota 'RÈTOLS INFORMATIUS'
1. Justificacio: les vinyetes i notes deixaven d'heretar l'estil 'List
   Paragraph' (jc=both) perque forcaven alineacio esquerra. Ara Format-Bullet
   i Format-Note justifiquen el text (com el document de referencia).
2. Espai sota 'RÈTOLS INFORMATIUS': nou marcador ::LABEL:: (Format-Label) que
   renderitza un rotul de subseccio amb espai a sota; la plantilla separa el
   rotul 'RÈTOLS INFORMATIUS' de la frase introductoria.

Co-Authored-By: Claude Opus 4.8 <noreply@anthropic.com>
Claude-Session: https://claude.ai/code/session_01JMJrmChJ5HaLxF2Q9xTa1S
</commit_message>
<xml_diff>
--- a/ESTRUCTURALS/ACT_EXTR_FAV.docx
+++ b/ESTRUCTURALS/ACT_EXTR_FAV.docx
@@ -327,13 +327,21 @@
         <w:pStyle w:val="Ttulo2"/>
       </w:pPr>
       <w:r>
-        <w:t>[[FAV_RETOLS_INTRO]] ::TEXT:: Rètols</w:t>
+        <w:t>[[FAV_RETOLS_HDR]] ::LABEL:: Rètol de la secció</w:t>
       </w:r>
     </w:p>
     <w:p>
       <w:pPr/>
       <w:r>
         <w:t>RÈTOLS INFORMATIUS</w:t>
+      </w:r>
+    </w:p>
+    <w:p>
+      <w:pPr>
+        <w:pStyle w:val="Ttulo2"/>
+      </w:pPr>
+      <w:r>
+        <w:t>[[FAV_RETOLS_INTRO]] ::TEXT:: Rètols</w:t>
       </w:r>
     </w:p>
     <w:p>

</xml_diff>

<commit_message>
Catalegs i vistes actualitzats des de Actualitzar.bat
</commit_message>
<xml_diff>
--- a/ESTRUCTURALS/ACT_EXTR_FAV.docx
+++ b/ESTRUCTURALS/ACT_EXTR_FAV.docx
@@ -312,11 +312,7 @@
         <w:t xml:space="preserve">8. </w:t>
       </w:r>
       <w:r>
-        <w:t xml:space="preserve">Controladors d’accés. Es disposarà d’un mínim de {{CONTROLADORS}} persones de personal de control d’accés. Aquest personal disposarà de l’habilitació per exercir </w:t>
-      </w:r>
-      <w:r>
-        <w:lastRenderedPageBreak/>
-        <w:t>aquestes funcions i estarà identificat portant de manera visible un distintiu amb la llegenda “Personal de control d’accés”.</w:t>
+        <w:t>Controladors d’accés. Es disposarà d’un mínim de {{CONTROLADORS}} persones de personal de control d’accés. Aquest personal disposarà de l’habilitació per exercir aquestes funcions i estarà identificat portant de manera visible un distintiu amb la llegenda “Personal de control d’accés”.</w:t>
       </w:r>
     </w:p>
     <w:p>
@@ -930,7 +926,7 @@
         <w:rPr>
           <w:i/>
         </w:rPr>
-        <w:t>Vista generada automàticament des de ACT_EXTR_FAV.json el 28/07/2026 15:17. No l'editis: els canvis es fan des de l'editor de catàlegs del programa.</w:t>
+        <w:t>Vista generada automàticament des de ACT_EXTR_FAV.json el 29/07/2026 10:21. No l'editis: els canvis es fan des de l'editor de catàlegs del programa.</w:t>
       </w:r>
       <w:bookmarkStart w:id="0" w:name="_GoBack"/>
       <w:bookmarkEnd w:id="0"/>

</xml_diff>